<commit_message>
Adds Ranger class, fixes Prisoner Exchange entry
</commit_message>
<xml_diff>
--- a/Character Templates/MS-Word/Brownie/Brownie Rogue Template.docx
+++ b/Character Templates/MS-Word/Brownie/Brownie Rogue Template.docx
@@ -15,8 +15,8 @@
       <w:r>
         <w:rPr>
           <w:rFonts w:ascii="FlutedGermanica" w:hAnsi="FlutedGermanica"/>
-          <w:sz w:val="58"/>
-          <w:szCs w:val="58"/>
+          <w:sz w:val="56"/>
+          <w:szCs w:val="56"/>
         </w:rPr>
         <w:t>B</w:t>
       </w:r>
@@ -26,7 +26,15 @@
           <w:sz w:val="44"/>
           <w:szCs w:val="44"/>
         </w:rPr>
-        <w:t>rownie</w:t>
+        <w:t xml:space="preserve">rownie </w:t>
+      </w:r>
+      <w:r>
+        <w:rPr>
+          <w:rFonts w:ascii="FlutedGermanica" w:hAnsi="FlutedGermanica"/>
+          <w:sz w:val="56"/>
+          <w:szCs w:val="56"/>
+        </w:rPr>
+        <w:t>R</w:t>
       </w:r>
       <w:r>
         <w:rPr>
@@ -34,15 +42,15 @@
           <w:sz w:val="44"/>
           <w:szCs w:val="44"/>
         </w:rPr>
-        <w:t xml:space="preserve"> </w:t>
+        <w:t xml:space="preserve">ogue </w:t>
       </w:r>
       <w:r>
         <w:rPr>
           <w:rFonts w:ascii="FlutedGermanica" w:hAnsi="FlutedGermanica"/>
-          <w:sz w:val="58"/>
-          <w:szCs w:val="58"/>
-        </w:rPr>
-        <w:t>R</w:t>
+          <w:sz w:val="56"/>
+          <w:szCs w:val="56"/>
+        </w:rPr>
+        <w:t>C</w:t>
       </w:r>
       <w:r>
         <w:rPr>
@@ -50,7 +58,15 @@
           <w:sz w:val="44"/>
           <w:szCs w:val="44"/>
         </w:rPr>
-        <w:t>ogue</w:t>
+        <w:t xml:space="preserve">haracter </w:t>
+      </w:r>
+      <w:r>
+        <w:rPr>
+          <w:rFonts w:ascii="FlutedGermanica" w:hAnsi="FlutedGermanica"/>
+          <w:sz w:val="56"/>
+          <w:szCs w:val="56"/>
+        </w:rPr>
+        <w:t>T</w:t>
       </w:r>
       <w:r>
         <w:rPr>
@@ -58,39 +74,22 @@
           <w:sz w:val="44"/>
           <w:szCs w:val="44"/>
         </w:rPr>
-        <w:t xml:space="preserve"> </w:t>
-      </w:r>
-      <w:r>
-        <w:rPr>
-          <w:rFonts w:ascii="FlutedGermanica" w:hAnsi="FlutedGermanica"/>
-          <w:sz w:val="58"/>
-          <w:szCs w:val="58"/>
-        </w:rPr>
-        <w:t>C</w:t>
-      </w:r>
-      <w:r>
-        <w:rPr>
-          <w:rFonts w:ascii="FlutedGermanica" w:hAnsi="FlutedGermanica"/>
-          <w:sz w:val="44"/>
-          <w:szCs w:val="44"/>
-        </w:rPr>
-        <w:t xml:space="preserve">haracter </w:t>
-      </w:r>
-      <w:r>
-        <w:rPr>
-          <w:rFonts w:ascii="FlutedGermanica" w:hAnsi="FlutedGermanica"/>
-          <w:sz w:val="58"/>
-          <w:szCs w:val="58"/>
-        </w:rPr>
-        <w:t>T</w:t>
-      </w:r>
-      <w:r>
-        <w:rPr>
-          <w:rFonts w:ascii="FlutedGermanica" w:hAnsi="FlutedGermanica"/>
-          <w:sz w:val="44"/>
-          <w:szCs w:val="44"/>
-        </w:rPr>
         <w:t>emplate</w:t>
+      </w:r>
+    </w:p>
+    <w:p>
+      <w:pPr>
+        <w:pStyle w:val="Normal"/>
+        <w:rPr>
+          <w:sz w:val="22"/>
+          <w:szCs w:val="22"/>
+        </w:rPr>
+      </w:pPr>
+      <w:r>
+        <w:rPr>
+          <w:sz w:val="22"/>
+          <w:szCs w:val="22"/>
+        </w:rPr>
       </w:r>
     </w:p>
     <w:p>
@@ -99,15 +98,6 @@
         <w:rPr/>
       </w:pPr>
       <w:r>
-        <w:rPr/>
-      </w:r>
-    </w:p>
-    <w:p>
-      <w:pPr>
-        <w:pStyle w:val="Normal"/>
-        <w:rPr/>
-      </w:pPr>
-      <w:r>
         <w:rPr>
           <w:b/>
           <w:bCs/>
@@ -116,15 +106,7 @@
       </w:r>
       <w:r>
         <w:rPr/>
-        <w:t xml:space="preserve"> :________________________</w:t>
-      </w:r>
-      <w:r>
-        <w:rPr/>
-        <w:t>_____</w:t>
-      </w:r>
-      <w:r>
-        <w:rPr/>
-        <w:t xml:space="preserve">    </w:t>
+        <w:t xml:space="preserve"> :_____________________________    </w:t>
       </w:r>
       <w:r>
         <w:rPr>
@@ -175,52 +157,7 @@
           <w:sz w:val="22"/>
           <w:szCs w:val="22"/>
         </w:rPr>
-        <w:t>(initial 2d6</w:t>
-      </w:r>
-      <w:r>
-        <w:rPr>
-          <w:i/>
-          <w:iCs/>
-          <w:sz w:val="22"/>
-          <w:szCs w:val="22"/>
-        </w:rPr>
-        <w:t>+</w:t>
-      </w:r>
-      <w:r>
-        <w:rPr>
-          <w:i/>
-          <w:iCs/>
-          <w:sz w:val="22"/>
-          <w:szCs w:val="22"/>
-        </w:rPr>
-        <w:t>1</w:t>
-      </w:r>
-      <w:r>
-        <w:rPr>
-          <w:i/>
-          <w:iCs/>
-          <w:sz w:val="22"/>
-          <w:szCs w:val="22"/>
-        </w:rPr>
-        <w:t>, +1d6-</w:t>
-      </w:r>
-      <w:r>
-        <w:rPr>
-          <w:i/>
-          <w:iCs/>
-          <w:sz w:val="22"/>
-          <w:szCs w:val="22"/>
-        </w:rPr>
-        <w:t xml:space="preserve">1 per </w:t>
-      </w:r>
-      <w:r>
-        <w:rPr>
-          <w:i/>
-          <w:iCs/>
-          <w:sz w:val="22"/>
-          <w:szCs w:val="22"/>
-        </w:rPr>
-        <w:t>level)</w:t>
+        <w:t>(initial 2d6+1, +1d6-1 per level)</w:t>
       </w:r>
     </w:p>
     <w:p>
@@ -256,14 +193,7 @@
       </w:r>
       <w:r>
         <w:rPr/>
-        <w:t>: __________________</w:t>
-      </w:r>
-      <w:r>
-        <w:rPr/>
-        <w:t>_______________</w:t>
-      </w:r>
-      <w:r>
-        <w:rPr/>
+        <w:t>: _________________________________</w:t>
         <w:tab/>
         <w:t xml:space="preserve">          </w:t>
       </w:r>
@@ -277,9 +207,6 @@
       <w:r>
         <w:rPr/>
         <w:t>:_______</w:t>
-      </w:r>
-      <w:r>
-        <w:rPr/>
         <w:tab/>
         <w:t xml:space="preserve"> </w:t>
       </w:r>
@@ -330,21 +257,6 @@
     <w:p>
       <w:pPr>
         <w:pStyle w:val="Normal"/>
-        <w:rPr>
-          <w:sz w:val="12"/>
-          <w:szCs w:val="12"/>
-        </w:rPr>
-      </w:pPr>
-      <w:r>
-        <w:rPr>
-          <w:sz w:val="12"/>
-          <w:szCs w:val="12"/>
-        </w:rPr>
-      </w:r>
-    </w:p>
-    <w:p>
-      <w:pPr>
-        <w:pStyle w:val="Normal"/>
         <w:jc w:val="both"/>
         <w:rPr>
           <w:sz w:val="22"/>
@@ -365,7 +277,7 @@
           <w:sz w:val="22"/>
           <w:szCs w:val="22"/>
         </w:rPr>
-        <w:t xml:space="preserve">: Rogues are equally dexterous and deadly, bringing valuable skills to combat and exploration alike. Rogues deliver devastating sneak attacks to susceptible enemies. To perform a sneak attack, the rogue must spend inactive then succeed a </w:t>
+        <w:t xml:space="preserve">: Rogues are equally dexterous and deadly, bringing valuable skills to combat and exploration alike. Rogues deliver devastating sneak attacks to susceptible enemies. To perform a sneak attack, the rogue must spend one turn inactive then succeed a </w:t>
       </w:r>
       <w:r>
         <w:rPr>
@@ -429,7 +341,7 @@
           <w:sz w:val="22"/>
           <w:szCs w:val="22"/>
         </w:rPr>
-        <w:t xml:space="preserve"> roll when searching, dealing with traps and picking locks. Starting at level 2, Rogues are able to use scrolls or wands with a proficiency of </w:t>
+        <w:t xml:space="preserve"> roll when searching and picking locks, and +2 when dealing with traps. Starting at level 2, Rogues are able to use scrolls or wands with a proficiency of </w:t>
       </w:r>
       <w:r>
         <w:rPr>
@@ -461,28 +373,7 @@
           <w:sz w:val="22"/>
           <w:szCs w:val="22"/>
         </w:rPr>
-        <w:t xml:space="preserve"> when rolling for combat order. </w:t>
-      </w:r>
-      <w:r>
-        <w:rPr>
-          <w:sz w:val="22"/>
-          <w:szCs w:val="22"/>
-        </w:rPr>
-        <w:t>U</w:t>
-      </w:r>
-      <w:r>
-        <w:rPr>
-          <w:sz w:val="22"/>
-          <w:szCs w:val="22"/>
-        </w:rPr>
-        <w:t xml:space="preserve">pon landing a critical attack, </w:t>
-      </w:r>
-      <w:r>
-        <w:rPr>
-          <w:sz w:val="22"/>
-          <w:szCs w:val="22"/>
-        </w:rPr>
-        <w:t xml:space="preserve">Rogues have a chance of delivering a fatal blow roll against </w:t>
+        <w:t xml:space="preserve"> when rolling for combat order. Upon landing a critical attack, Rogues have a chance of delivering a fatal blow roll against </w:t>
       </w:r>
       <w:r>
         <w:rPr>
@@ -492,6 +383,22 @@
           <w:szCs w:val="22"/>
         </w:rPr>
         <w:t>monster_hp_dice-level</w:t>
+      </w:r>
+      <w:r>
+        <w:rPr>
+          <w:sz w:val="22"/>
+          <w:szCs w:val="22"/>
+        </w:rPr>
+        <w:t xml:space="preserve">, if the attack succeeds, you have defeated your opponent. If it fails, it will still inflict normal damage. When you roll a critical attack against non boss-enemies roll against </w:t>
+      </w:r>
+      <w:r>
+        <w:rPr>
+          <w:i/>
+          <w:iCs/>
+          <w:sz w:val="22"/>
+          <w:szCs w:val="22"/>
+        </w:rPr>
+        <w:t>(monster_hp_dice - character_level)</w:t>
       </w:r>
       <w:r>
         <w:rPr>
@@ -694,14 +601,7 @@
                 <w:sz w:val="22"/>
                 <w:szCs w:val="22"/>
               </w:rPr>
-              <w:t xml:space="preserve">: </w:t>
-            </w:r>
-            <w:r>
-              <w:rPr>
-                <w:sz w:val="22"/>
-                <w:szCs w:val="22"/>
-              </w:rPr>
-              <w:t>5</w:t>
+              <w:t>: 5</w:t>
             </w:r>
           </w:p>
         </w:tc>
@@ -726,8 +626,31 @@
                 <w:sz w:val="22"/>
                 <w:szCs w:val="22"/>
               </w:rPr>
-              <w:t>De</w:t>
-            </w:r>
+              <w:t>Dex</w:t>
+            </w:r>
+            <w:r>
+              <w:rPr>
+                <w:sz w:val="22"/>
+                <w:szCs w:val="22"/>
+              </w:rPr>
+              <w:t>: 3</w:t>
+            </w:r>
+          </w:p>
+        </w:tc>
+        <w:tc>
+          <w:tcPr>
+            <w:tcW w:w="1984" w:type="dxa"/>
+            <w:tcBorders/>
+          </w:tcPr>
+          <w:p>
+            <w:pPr>
+              <w:pStyle w:val="TableContents"/>
+              <w:jc w:val="center"/>
+              <w:rPr>
+                <w:sz w:val="22"/>
+                <w:szCs w:val="22"/>
+              </w:rPr>
+            </w:pPr>
             <w:r>
               <w:rPr>
                 <w:i/>
@@ -735,60 +658,14 @@
                 <w:sz w:val="22"/>
                 <w:szCs w:val="22"/>
               </w:rPr>
-              <w:t>x</w:t>
+              <w:t>Magic</w:t>
             </w:r>
             <w:r>
               <w:rPr>
                 <w:sz w:val="22"/>
                 <w:szCs w:val="22"/>
               </w:rPr>
-              <w:t xml:space="preserve">: </w:t>
-            </w:r>
-            <w:r>
-              <w:rPr>
-                <w:sz w:val="22"/>
-                <w:szCs w:val="22"/>
-              </w:rPr>
-              <w:t>3</w:t>
-            </w:r>
-          </w:p>
-        </w:tc>
-        <w:tc>
-          <w:tcPr>
-            <w:tcW w:w="1984" w:type="dxa"/>
-            <w:tcBorders/>
-          </w:tcPr>
-          <w:p>
-            <w:pPr>
-              <w:pStyle w:val="TableContents"/>
-              <w:jc w:val="center"/>
-              <w:rPr>
-                <w:sz w:val="22"/>
-                <w:szCs w:val="22"/>
-              </w:rPr>
-            </w:pPr>
-            <w:r>
-              <w:rPr>
-                <w:i/>
-                <w:iCs/>
-                <w:sz w:val="22"/>
-                <w:szCs w:val="22"/>
-              </w:rPr>
-              <w:t>Magic</w:t>
-            </w:r>
-            <w:r>
-              <w:rPr>
-                <w:sz w:val="22"/>
-                <w:szCs w:val="22"/>
-              </w:rPr>
-              <w:t xml:space="preserve">: </w:t>
-            </w:r>
-            <w:r>
-              <w:rPr>
-                <w:sz w:val="22"/>
-                <w:szCs w:val="22"/>
-              </w:rPr>
-              <w:t>4</w:t>
+              <w:t>: 4</w:t>
             </w:r>
           </w:p>
         </w:tc>
@@ -810,51 +687,12 @@
           <w:sz w:val="22"/>
           <w:szCs w:val="22"/>
         </w:rPr>
-        <w:t>Roll against the value above</w:t>
-      </w:r>
-      <w:r>
-        <w:rPr>
-          <w:i/>
-          <w:iCs/>
-          <w:sz w:val="22"/>
-          <w:szCs w:val="22"/>
-        </w:rPr>
-        <w:t xml:space="preserve">. </w:t>
-      </w:r>
-      <w:r>
-        <w:rPr>
-          <w:i/>
-          <w:iCs/>
-          <w:sz w:val="22"/>
-          <w:szCs w:val="22"/>
-        </w:rPr>
-        <w:t>Should you find something that alters your saves then modify accordingly.</w:t>
+        <w:t>Roll against the value above. Should you find something that alters your saves then modify accordingly.</w:t>
       </w:r>
     </w:p>
     <w:p>
       <w:pPr>
         <w:pStyle w:val="Normal"/>
-        <w:jc w:val="center"/>
-        <w:rPr>
-          <w:i/>
-          <w:i/>
-          <w:iCs/>
-          <w:sz w:val="12"/>
-          <w:szCs w:val="12"/>
-        </w:rPr>
-      </w:pPr>
-      <w:r>
-        <w:rPr>
-          <w:i/>
-          <w:iCs/>
-          <w:sz w:val="12"/>
-          <w:szCs w:val="12"/>
-        </w:rPr>
-      </w:r>
-    </w:p>
-    <w:p>
-      <w:pPr>
-        <w:pStyle w:val="Normal"/>
         <w:rPr>
           <w:sz w:val="22"/>
           <w:szCs w:val="22"/>
@@ -874,49 +712,7 @@
           <w:sz w:val="22"/>
           <w:szCs w:val="22"/>
         </w:rPr>
-        <w:t>A</w:t>
-      </w:r>
-      <w:r>
-        <w:rPr>
-          <w:sz w:val="22"/>
-          <w:szCs w:val="22"/>
-        </w:rPr>
-        <w:t xml:space="preserve"> </w:t>
-      </w:r>
-      <w:r>
-        <w:rPr>
-          <w:sz w:val="22"/>
-          <w:szCs w:val="22"/>
-        </w:rPr>
-        <w:t>Brownie</w:t>
-      </w:r>
-      <w:r>
-        <w:rPr>
-          <w:sz w:val="22"/>
-          <w:szCs w:val="22"/>
-        </w:rPr>
-        <w:t xml:space="preserve"> </w:t>
-      </w:r>
-      <w:r>
-        <w:rPr>
-          <w:sz w:val="22"/>
-          <w:szCs w:val="22"/>
-        </w:rPr>
-        <w:t>Rogue</w:t>
-      </w:r>
-      <w:r>
-        <w:rPr>
-          <w:sz w:val="22"/>
-          <w:szCs w:val="22"/>
-        </w:rPr>
-        <w:t xml:space="preserve"> </w:t>
-      </w:r>
-      <w:r>
-        <w:rPr>
-          <w:sz w:val="22"/>
-          <w:szCs w:val="22"/>
-        </w:rPr>
-        <w:t>can use single handed weapons or ranged weapons for attack. For armor they can equip a Brigadine, no regular shields nor helmets.</w:t>
+        <w:t>A Brownie Rogue can use single handed weapons or ranged weapons for attack. For armor they can equip a Brigadine, no regular shields nor helmets.</w:t>
       </w:r>
     </w:p>
     <w:p>
@@ -948,11 +744,7 @@
       </w:r>
       <w:r>
         <w:rPr/>
-        <w:t xml:space="preserve">:       </w:t>
-      </w:r>
-      <w:r>
-        <w:rPr/>
-        <w:t xml:space="preserve">_________________   </w:t>
+        <w:t xml:space="preserve">:       _________________   </w:t>
       </w:r>
       <w:r>
         <w:rPr>
@@ -969,48 +761,29 @@
     <w:p>
       <w:pPr>
         <w:pStyle w:val="Normal"/>
+        <w:rPr>
+          <w:sz w:val="22"/>
+          <w:szCs w:val="22"/>
+        </w:rPr>
+      </w:pPr>
+      <w:r>
         <w:rPr/>
-      </w:pPr>
-      <w:r>
-        <w:rPr/>
-        <w:t>__</w:t>
-      </w:r>
-      <w:r>
-        <w:rPr/>
-        <w:t>____</w:t>
-      </w:r>
-      <w:r>
-        <w:rPr/>
-        <w:t>_</w:t>
-      </w:r>
-      <w:r>
-        <w:rPr/>
-        <w:t>_</w:t>
-      </w:r>
-      <w:r>
-        <w:rPr/>
-        <w:t xml:space="preserve">__: __________________ </w:t>
-      </w:r>
-      <w:r>
-        <w:rPr/>
-        <w:t>__</w:t>
-      </w:r>
-      <w:r>
-        <w:rPr/>
-        <w:t>_____: __________________</w:t>
-      </w:r>
-      <w:r>
-        <w:rPr/>
-        <w:t>__</w:t>
+        <w:t>__________: __________________ _______: ____________________</w:t>
       </w:r>
     </w:p>
     <w:p>
       <w:pPr>
         <w:pStyle w:val="Normal"/>
-        <w:rPr/>
+        <w:rPr>
+          <w:sz w:val="22"/>
+          <w:szCs w:val="22"/>
+        </w:rPr>
       </w:pPr>
       <w:r>
-        <w:rPr/>
+        <w:rPr>
+          <w:sz w:val="22"/>
+          <w:szCs w:val="22"/>
+        </w:rPr>
       </w:r>
     </w:p>
     <w:tbl>
@@ -2650,60 +2423,40 @@
           <w:sz w:val="22"/>
           <w:szCs w:val="22"/>
         </w:rPr>
-        <w:t xml:space="preserve">* You start </w:t>
-      </w:r>
-      <w:r>
-        <w:rPr>
-          <w:i/>
-          <w:iCs/>
-          <w:sz w:val="22"/>
-          <w:szCs w:val="22"/>
-        </w:rPr>
-        <w:t xml:space="preserve">the game </w:t>
-      </w:r>
-      <w:r>
-        <w:rPr>
-          <w:i/>
-          <w:iCs/>
-          <w:sz w:val="22"/>
-          <w:szCs w:val="22"/>
-        </w:rPr>
-        <w:t xml:space="preserve">with 5 torches &amp; 5 rations, </w:t>
-      </w:r>
-      <w:r>
-        <w:rPr>
-          <w:i/>
-          <w:iCs/>
-          <w:sz w:val="22"/>
-          <w:szCs w:val="22"/>
-        </w:rPr>
-        <w:t>set aside a slot for torches and another for rations</w:t>
-      </w:r>
-      <w:r>
-        <w:rPr>
-          <w:i/>
-          <w:iCs/>
-          <w:sz w:val="22"/>
-          <w:szCs w:val="22"/>
-        </w:rPr>
-        <w:t>.</w:t>
+        <w:t>* You start the game with 5 torches &amp; 5 rations, set aside a slot for torches and another for rations.</w:t>
       </w:r>
     </w:p>
     <w:sectPr>
-      <w:footerReference w:type="default" r:id="rId2"/>
+      <w:footerReference w:type="even" r:id="rId2"/>
+      <w:footerReference w:type="default" r:id="rId3"/>
+      <w:footerReference w:type="first" r:id="rId4"/>
       <w:type w:val="nextPage"/>
       <w:pgSz w:w="12240" w:h="15840"/>
       <w:pgMar w:left="1134" w:right="1134" w:gutter="0" w:header="0" w:top="1134" w:footer="994" w:bottom="1949"/>
       <w:pgNumType w:fmt="decimal"/>
       <w:formProt w:val="false"/>
       <w:textDirection w:val="lrTb"/>
-      <w:docGrid w:type="default" w:linePitch="312" w:charSpace="4294961151"/>
+      <w:docGrid w:type="default" w:linePitch="312" w:charSpace="0"/>
     </w:sectPr>
   </w:body>
 </w:document>
 </file>
 
 <file path=word/footer1.xml><?xml version="1.0" encoding="utf-8"?>
+<w:ftr xmlns:o="urn:schemas-microsoft-com:office:office" xmlns:r="http://schemas.openxmlformats.org/officeDocument/2006/relationships" xmlns:v="urn:schemas-microsoft-com:vml" xmlns:w="http://schemas.openxmlformats.org/wordprocessingml/2006/main" xmlns:w10="urn:schemas-microsoft-com:office:word" xmlns:wp="http://schemas.openxmlformats.org/drawingml/2006/wordprocessingDrawing" xmlns:pic="http://schemas.openxmlformats.org/drawingml/2006/picture" xmlns:wps="http://schemas.microsoft.com/office/word/2010/wordprocessingShape" xmlns:wpg="http://schemas.microsoft.com/office/word/2010/wordprocessingGroup" xmlns:mc="http://schemas.openxmlformats.org/markup-compatibility/2006" xmlns:wp14="http://schemas.microsoft.com/office/word/2010/wordprocessingDrawing" xmlns:w14="http://schemas.microsoft.com/office/word/2010/wordml" xmlns:w15="http://schemas.microsoft.com/office/word/2012/wordml" mc:Ignorable="w14 wp14 w15">
+  <w:p>
+    <w:pPr>
+      <w:pStyle w:val="Footer"/>
+      <w:rPr/>
+    </w:pPr>
+    <w:r>
+      <w:rPr/>
+    </w:r>
+  </w:p>
+</w:ftr>
+</file>
+
+<file path=word/footer2.xml><?xml version="1.0" encoding="utf-8"?>
 <w:ftr xmlns:o="urn:schemas-microsoft-com:office:office" xmlns:r="http://schemas.openxmlformats.org/officeDocument/2006/relationships" xmlns:v="urn:schemas-microsoft-com:vml" xmlns:w="http://schemas.openxmlformats.org/wordprocessingml/2006/main" xmlns:w10="urn:schemas-microsoft-com:office:word" xmlns:wp="http://schemas.openxmlformats.org/drawingml/2006/wordprocessingDrawing" xmlns:pic="http://schemas.openxmlformats.org/drawingml/2006/picture" xmlns:wps="http://schemas.microsoft.com/office/word/2010/wordprocessingShape" xmlns:wpg="http://schemas.microsoft.com/office/word/2010/wordprocessingGroup" xmlns:mc="http://schemas.openxmlformats.org/markup-compatibility/2006" xmlns:wp14="http://schemas.microsoft.com/office/word/2010/wordprocessingDrawing" xmlns:w14="http://schemas.microsoft.com/office/word/2010/wordml" xmlns:w15="http://schemas.microsoft.com/office/word/2012/wordml" mc:Ignorable="w14 wp14 w15">
   <w:p>
     <w:pPr>
@@ -2734,21 +2487,7 @@
         <w:i/>
         <w:iCs/>
       </w:rPr>
-      <w:t xml:space="preserve"> </w:t>
-    </w:r>
-    <w:r>
-      <w:rPr>
-        <w:i/>
-        <w:iCs/>
-      </w:rPr>
-      <w:t>a</w:t>
-    </w:r>
-    <w:r>
-      <w:rPr>
-        <w:i/>
-        <w:iCs/>
-      </w:rPr>
-      <w:t xml:space="preserve"> </w:t>
+      <w:t xml:space="preserve"> a </w:t>
     </w:r>
     <w:hyperlink r:id="rId1">
       <w:r>
@@ -2810,7 +2549,18 @@
         <w:sz w:val="20"/>
         <w:szCs w:val="20"/>
       </w:rPr>
-      <w:t>C</w:t>
+      <w:t>Creative Commons 4.0</w:t>
+    </w:r>
+    <w:r>
+      <w:rPr>
+        <w:b/>
+        <w:bCs/>
+        <w:i w:val="false"/>
+        <w:iCs w:val="false"/>
+        <w:sz w:val="20"/>
+        <w:szCs w:val="20"/>
+      </w:rPr>
+      <w:t xml:space="preserve"> </w:t>
     </w:r>
     <w:r>
       <w:rPr>
@@ -2821,29 +2571,107 @@
         <w:sz w:val="20"/>
         <w:szCs w:val="20"/>
       </w:rPr>
-      <w:t xml:space="preserve">reative </w:t>
+      <w:t>CC-BY-SA</w:t>
     </w:r>
     <w:r>
       <w:rPr>
-        <w:b w:val="false"/>
-        <w:bCs w:val="false"/>
+        <w:b/>
+        <w:bCs/>
         <w:i w:val="false"/>
         <w:iCs w:val="false"/>
         <w:sz w:val="20"/>
         <w:szCs w:val="20"/>
       </w:rPr>
-      <w:t>C</w:t>
+      <w:t xml:space="preserve"> by </w:t>
     </w:r>
     <w:r>
       <w:rPr>
+        <w:rFonts w:ascii="Cloister Black" w:hAnsi="Cloister Black"/>
         <w:b w:val="false"/>
         <w:bCs w:val="false"/>
+        <w:i w:val="false"/>
+        <w:iCs w:val="false"/>
+        <w:sz w:val="28"/>
+        <w:szCs w:val="28"/>
+      </w:rPr>
+      <w:t>BIT Mysteries</w:t>
+    </w:r>
+  </w:p>
+</w:ftr>
+</file>
+
+<file path=word/footer3.xml><?xml version="1.0" encoding="utf-8"?>
+<w:ftr xmlns:o="urn:schemas-microsoft-com:office:office" xmlns:r="http://schemas.openxmlformats.org/officeDocument/2006/relationships" xmlns:v="urn:schemas-microsoft-com:vml" xmlns:w="http://schemas.openxmlformats.org/wordprocessingml/2006/main" xmlns:w10="urn:schemas-microsoft-com:office:word" xmlns:wp="http://schemas.openxmlformats.org/drawingml/2006/wordprocessingDrawing" xmlns:pic="http://schemas.openxmlformats.org/drawingml/2006/picture" xmlns:wps="http://schemas.microsoft.com/office/word/2010/wordprocessingShape" xmlns:wpg="http://schemas.microsoft.com/office/word/2010/wordprocessingGroup" xmlns:mc="http://schemas.openxmlformats.org/markup-compatibility/2006" xmlns:wp14="http://schemas.microsoft.com/office/word/2010/wordprocessingDrawing" xmlns:w14="http://schemas.microsoft.com/office/word/2010/wordml" xmlns:w15="http://schemas.microsoft.com/office/word/2012/wordml" mc:Ignorable="w14 wp14 w15">
+  <w:p>
+    <w:pPr>
+      <w:pStyle w:val="Normal"/>
+      <w:jc w:val="center"/>
+      <w:rPr>
+        <w:rFonts w:ascii="Liberation Serif" w:hAnsi="Liberation Serif"/>
+      </w:rPr>
+    </w:pPr>
+    <w:r>
+      <w:rPr>
+        <w:rFonts w:ascii="Ruritania" w:hAnsi="Ruritania"/>
+        <w:sz w:val="28"/>
+        <w:szCs w:val="28"/>
+      </w:rPr>
+      <w:t>T</w:t>
+    </w:r>
+    <w:r>
+      <w:rPr>
+        <w:rFonts w:ascii="Cloister Black" w:hAnsi="Cloister Black"/>
+        <w:sz w:val="28"/>
+        <w:szCs w:val="28"/>
+      </w:rPr>
+      <w:t>he Hunt for the Treasure of Aural Hall</w:t>
+    </w:r>
+    <w:r>
+      <w:rPr>
+        <w:i/>
+        <w:iCs/>
+      </w:rPr>
+      <w:t xml:space="preserve"> a </w:t>
+    </w:r>
+    <w:hyperlink r:id="rId1">
+      <w:r>
+        <w:rPr>
+          <w:rStyle w:val="Hyperlink"/>
+          <w:rFonts w:ascii="Beckett" w:hAnsi="Beckett"/>
+          <w:i/>
+          <w:iCs/>
+          <w:sz w:val="28"/>
+          <w:szCs w:val="28"/>
+        </w:rPr>
+        <w:t>DepthRangers</w:t>
+      </w:r>
+    </w:hyperlink>
+    <w:r>
+      <w:rPr>
+        <w:i/>
+        <w:iCs/>
+      </w:rPr>
+      <w:t xml:space="preserve"> Solo/COOP campaign</w:t>
+    </w:r>
+  </w:p>
+  <w:p>
+    <w:pPr>
+      <w:pStyle w:val="Normal"/>
+      <w:jc w:val="center"/>
+      <w:rPr>
+        <w:rFonts w:ascii="Liberation Serif" w:hAnsi="Liberation Serif"/>
+      </w:rPr>
+    </w:pPr>
+    <w:r>
+      <w:rPr>
+        <w:b/>
+        <w:bCs/>
         <w:i w:val="false"/>
         <w:iCs w:val="false"/>
         <w:sz w:val="20"/>
         <w:szCs w:val="20"/>
       </w:rPr>
-      <w:t>ommons</w:t>
+      <w:t xml:space="preserve">                                                                    </w:t>
     </w:r>
     <w:r>
       <w:rPr>
@@ -2865,7 +2693,7 @@
         <w:sz w:val="20"/>
         <w:szCs w:val="20"/>
       </w:rPr>
-      <w:t>4.0</w:t>
+      <w:t>Creative Commons 4.0</w:t>
     </w:r>
     <w:r>
       <w:rPr>
@@ -2887,18 +2715,7 @@
         <w:sz w:val="20"/>
         <w:szCs w:val="20"/>
       </w:rPr>
-      <w:t>CC-</w:t>
-    </w:r>
-    <w:r>
-      <w:rPr>
-        <w:b w:val="false"/>
-        <w:bCs w:val="false"/>
-        <w:i w:val="false"/>
-        <w:iCs w:val="false"/>
-        <w:sz w:val="20"/>
-        <w:szCs w:val="20"/>
-      </w:rPr>
-      <w:t>BY-SA</w:t>
+      <w:t>CC-BY-SA</w:t>
     </w:r>
     <w:r>
       <w:rPr>
@@ -2909,29 +2726,7 @@
         <w:sz w:val="20"/>
         <w:szCs w:val="20"/>
       </w:rPr>
-      <w:t xml:space="preserve"> </w:t>
-    </w:r>
-    <w:r>
-      <w:rPr>
-        <w:b/>
-        <w:bCs/>
-        <w:i w:val="false"/>
-        <w:iCs w:val="false"/>
-        <w:sz w:val="20"/>
-        <w:szCs w:val="20"/>
-      </w:rPr>
-      <w:t>by</w:t>
-    </w:r>
-    <w:r>
-      <w:rPr>
-        <w:b/>
-        <w:bCs/>
-        <w:i w:val="false"/>
-        <w:iCs w:val="false"/>
-        <w:sz w:val="20"/>
-        <w:szCs w:val="20"/>
-      </w:rPr>
-      <w:t xml:space="preserve"> </w:t>
+      <w:t xml:space="preserve"> by </w:t>
     </w:r>
     <w:r>
       <w:rPr>
@@ -2963,7 +2758,6 @@
     </w:rPrDefault>
     <w:pPrDefault>
       <w:pPr>
-        <w:widowControl/>
         <w:suppressAutoHyphens w:val="true"/>
       </w:pPr>
     </w:pPrDefault>
@@ -2973,10 +2767,11 @@
     <w:qFormat/>
     <w:pPr>
       <w:widowControl/>
-      <w:kinsoku w:val="true"/>
-      <w:overflowPunct w:val="true"/>
-      <w:autoSpaceDE w:val="true"/>
+      <w:suppressAutoHyphens w:val="true"/>
+      <w:overflowPunct w:val="false"/>
       <w:bidi w:val="0"/>
+      <w:spacing w:before="0" w:after="0"/>
+      <w:jc w:val="start"/>
     </w:pPr>
     <w:rPr>
       <w:rFonts w:ascii="Liberation Serif" w:hAnsi="Liberation Serif" w:eastAsia="Droid Sans Fallback" w:cs="FreeSans"/>

</xml_diff>